<commit_message>
Drop TOC from NMI Article and SI (HTML and DOCX)
Per NMI guidelines: main Articles do not carry a TOC, and SI TOCs are optional. The previous nav blocks (with hyperlinked section list and tables/figures sub-index) rendered awkwardly in Word as a numbered list with dead anchor links. Removing them gives reviewers a cleaner read in both surfaces.

- Removed <nav class="toc"> from paper/NMIPaper.html and paper/NMIPaperSI.html.
- Rebuilt paper/NMIPaper.docx and paper/NMIPaperSI.docx via the same html2doc pipeline (review-manuscript profile, native Word OMML equations preserved: 197 in main, 363 in SI).

Co-Authored-By: Claude Opus 4.7 (1M context) <noreply@anthropic.com>
</commit_message>
<xml_diff>
--- a/paper/NMIPaper.docx
+++ b/paper/NMIPaper.docx
@@ -153,440 +153,6 @@
       <w:pPr>
         <w:pStyle w:val="BodyText"/>
         <w:jc w:val="both"/>
-        <w:keepNext w:val="0"/>
-        <w:keepLines w:val="0"/>
-        <w:widowControl w:val="1"/>
-      </w:pPr>
-      <w:r>
-        <w:t xml:space="preserve">Article contents</w:t>
-      </w:r>
-    </w:p>
-    <w:p>
-      <w:pPr>
-        <w:pStyle w:val="Compact"/>
-        <w:numPr>
-          <w:ilvl w:val="0"/>
-          <w:numId w:val="1001"/>
-        </w:numPr>
-        <w:jc w:val="both"/>
-        <w:keepNext w:val="0"/>
-        <w:keepLines w:val="0"/>
-        <w:widowControl w:val="1"/>
-      </w:pPr>
-      <w:hyperlink w:anchor="sec-results">
-        <w:r>
-          <w:rPr>
-            <w:rStyle w:val="Hyperlink"/>
-          </w:rPr>
-          <w:t xml:space="preserve">Results</w:t>
-        </w:r>
-      </w:hyperlink>
-    </w:p>
-    <w:p>
-      <w:pPr>
-        <w:pStyle w:val="Compact"/>
-        <w:numPr>
-          <w:ilvl w:val="1"/>
-          <w:numId w:val="1002"/>
-        </w:numPr>
-        <w:jc w:val="both"/>
-        <w:keepNext w:val="0"/>
-        <w:keepLines w:val="0"/>
-        <w:widowControl w:val="1"/>
-      </w:pPr>
-      <w:hyperlink w:anchor="res-pq">
-        <w:r>
-          <w:rPr>
-            <w:rStyle w:val="Hyperlink"/>
-          </w:rPr>
-          <w:t xml:space="preserve">Productive-quadrant generation</w:t>
-        </w:r>
-      </w:hyperlink>
-    </w:p>
-    <w:p>
-      <w:pPr>
-        <w:pStyle w:val="Compact"/>
-        <w:numPr>
-          <w:ilvl w:val="1"/>
-          <w:numId w:val="1002"/>
-        </w:numPr>
-        <w:jc w:val="both"/>
-        <w:keepNext w:val="0"/>
-        <w:keepLines w:val="0"/>
-        <w:widowControl w:val="1"/>
-      </w:pPr>
-      <w:hyperlink w:anchor="res-leads">
-        <w:r>
-          <w:rPr>
-            <w:rStyle w:val="Hyperlink"/>
-          </w:rPr>
-          <w:t xml:space="preserve">Twelve DFT-confirmed leads</w:t>
-        </w:r>
-      </w:hyperlink>
-    </w:p>
-    <w:p>
-      <w:pPr>
-        <w:pStyle w:val="Compact"/>
-        <w:numPr>
-          <w:ilvl w:val="1"/>
-          <w:numId w:val="1002"/>
-        </w:numPr>
-        <w:jc w:val="both"/>
-        <w:keepNext w:val="0"/>
-        <w:keepLines w:val="0"/>
-        <w:widowControl w:val="1"/>
-      </w:pPr>
-      <w:hyperlink w:anchor="res-dft">
-        <w:r>
-          <w:rPr>
-            <w:rStyle w:val="Hyperlink"/>
-          </w:rPr>
-          <w:t xml:space="preserve">Calibrated DFT validation</w:t>
-        </w:r>
-      </w:hyperlink>
-    </w:p>
-    <w:p>
-      <w:pPr>
-        <w:pStyle w:val="Compact"/>
-        <w:numPr>
-          <w:ilvl w:val="1"/>
-          <w:numId w:val="1002"/>
-        </w:numPr>
-        <w:jc w:val="both"/>
-        <w:keepNext w:val="0"/>
-        <w:keepLines w:val="0"/>
-        <w:widowControl w:val="1"/>
-      </w:pPr>
-      <w:hyperlink w:anchor="res-novelty">
-        <w:r>
-          <w:rPr>
-            <w:rStyle w:val="Hyperlink"/>
-          </w:rPr>
-          <w:t xml:space="preserve">Novelty and synthesisability</w:t>
-        </w:r>
-      </w:hyperlink>
-    </w:p>
-    <w:p>
-      <w:pPr>
-        <w:pStyle w:val="Compact"/>
-        <w:numPr>
-          <w:ilvl w:val="1"/>
-          <w:numId w:val="1002"/>
-        </w:numPr>
-        <w:jc w:val="both"/>
-        <w:keepNext w:val="0"/>
-        <w:keepLines w:val="0"/>
-        <w:widowControl w:val="1"/>
-      </w:pPr>
-      <w:hyperlink w:anchor="res-ablations">
-        <w:r>
-          <w:rPr>
-            <w:rStyle w:val="Hyperlink"/>
-          </w:rPr>
-          <w:t xml:space="preserve">Component contributions</w:t>
-        </w:r>
-      </w:hyperlink>
-    </w:p>
-    <w:p>
-      <w:pPr>
-        <w:pStyle w:val="Compact"/>
-        <w:numPr>
-          <w:ilvl w:val="0"/>
-          <w:numId w:val="1001"/>
-        </w:numPr>
-        <w:jc w:val="both"/>
-        <w:keepNext w:val="0"/>
-        <w:keepLines w:val="0"/>
-        <w:widowControl w:val="1"/>
-      </w:pPr>
-      <w:hyperlink w:anchor="sec-disc">
-        <w:r>
-          <w:rPr>
-            <w:rStyle w:val="Hyperlink"/>
-          </w:rPr>
-          <w:t xml:space="preserve">Discussion</w:t>
-        </w:r>
-      </w:hyperlink>
-    </w:p>
-    <w:p>
-      <w:pPr>
-        <w:pStyle w:val="ReferencesHeading"/>
-        <w:numPr>
-          <w:ilvl w:val="0"/>
-          <w:numId w:val="1001"/>
-        </w:numPr>
-        <w:jc w:val="left"/>
-        <w:keepNext/>
-        <w:keepLines/>
-        <w:widowControl w:val="1"/>
-      </w:pPr>
-      <w:hyperlink w:anchor="sec-refs">
-        <w:r>
-          <w:rPr>
-            <w:rStyle w:val="Hyperlink"/>
-          </w:rPr>
-          <w:t xml:space="preserve">References</w:t>
-        </w:r>
-      </w:hyperlink>
-    </w:p>
-    <w:p>
-      <w:pPr>
-        <w:pStyle w:val="ReferenceEntry"/>
-        <w:numPr>
-          <w:ilvl w:val="0"/>
-          <w:numId w:val="1001"/>
-        </w:numPr>
-        <w:jc w:val="left"/>
-        <w:keepNext w:val="0"/>
-        <w:keepLines w:val="0"/>
-        <w:widowControl w:val="1"/>
-      </w:pPr>
-      <w:hyperlink w:anchor="sec-methods">
-        <w:r>
-          <w:rPr>
-            <w:rStyle w:val="Hyperlink"/>
-            <w:b/>
-            <w:bCs/>
-          </w:rPr>
-          <w:t xml:space="preserve">Methods</w:t>
-        </w:r>
-      </w:hyperlink>
-    </w:p>
-    <w:p>
-      <w:pPr>
-        <w:pStyle w:val="ReferenceEntry"/>
-        <w:numPr>
-          <w:ilvl w:val="1"/>
-          <w:numId w:val="1003"/>
-        </w:numPr>
-        <w:jc w:val="left"/>
-        <w:keepNext w:val="0"/>
-        <w:keepLines w:val="0"/>
-        <w:widowControl w:val="1"/>
-      </w:pPr>
-      <w:hyperlink w:anchor="m-dataset">
-        <w:r>
-          <w:rPr>
-            <w:rStyle w:val="Hyperlink"/>
-          </w:rPr>
-          <w:t xml:space="preserve">Dataset and four-tier label hierarchy</w:t>
-        </w:r>
-      </w:hyperlink>
-    </w:p>
-    <w:p>
-      <w:pPr>
-        <w:pStyle w:val="ReferenceEntry"/>
-        <w:numPr>
-          <w:ilvl w:val="1"/>
-          <w:numId w:val="1003"/>
-        </w:numPr>
-        <w:jc w:val="left"/>
-        <w:keepNext w:val="0"/>
-        <w:keepLines w:val="0"/>
-        <w:widowControl w:val="1"/>
-      </w:pPr>
-      <w:hyperlink w:anchor="m-limo">
-        <w:r>
-          <w:rPr>
-            <w:rStyle w:val="Hyperlink"/>
-          </w:rPr>
-          <w:t xml:space="preserve">Latent encoder (LIMO)</w:t>
-        </w:r>
-      </w:hyperlink>
-    </w:p>
-    <w:p>
-      <w:pPr>
-        <w:pStyle w:val="ReferenceEntry"/>
-        <w:numPr>
-          <w:ilvl w:val="1"/>
-          <w:numId w:val="1003"/>
-        </w:numPr>
-        <w:jc w:val="left"/>
-        <w:keepNext w:val="0"/>
-        <w:keepLines w:val="0"/>
-        <w:widowControl w:val="1"/>
-      </w:pPr>
-      <w:hyperlink w:anchor="m-denoisers">
-        <w:r>
-          <w:rPr>
-            <w:rStyle w:val="Hyperlink"/>
-          </w:rPr>
-          <w:t xml:space="preserve">Two complementary denoisers</w:t>
-        </w:r>
-      </w:hyperlink>
-    </w:p>
-    <w:p>
-      <w:pPr>
-        <w:pStyle w:val="ReferenceEntry"/>
-        <w:numPr>
-          <w:ilvl w:val="1"/>
-          <w:numId w:val="1003"/>
-        </w:numPr>
-        <w:jc w:val="left"/>
-        <w:keepNext w:val="0"/>
-        <w:keepLines w:val="0"/>
-        <w:widowControl w:val="1"/>
-      </w:pPr>
-      <w:hyperlink w:anchor="m-scoremodel">
-        <w:r>
-          <w:rPr>
-            <w:rStyle w:val="Hyperlink"/>
-          </w:rPr>
-          <w:t xml:space="preserve">Multi-task score model and self-distillation</w:t>
-        </w:r>
-      </w:hyperlink>
-    </w:p>
-    <w:p>
-      <w:pPr>
-        <w:pStyle w:val="ReferenceEntry"/>
-        <w:numPr>
-          <w:ilvl w:val="1"/>
-          <w:numId w:val="1003"/>
-        </w:numPr>
-        <w:jc w:val="left"/>
-        <w:keepNext w:val="0"/>
-        <w:keepLines w:val="0"/>
-        <w:widowControl w:val="1"/>
-      </w:pPr>
-      <w:hyperlink w:anchor="m-sampling">
-        <w:r>
-          <w:rPr>
-            <w:rStyle w:val="Hyperlink"/>
-          </w:rPr>
-          <w:t xml:space="preserve">Sampling with multi-task steering</w:t>
-        </w:r>
-      </w:hyperlink>
-    </w:p>
-    <w:p>
-      <w:pPr>
-        <w:pStyle w:val="ReferenceEntry"/>
-        <w:numPr>
-          <w:ilvl w:val="1"/>
-          <w:numId w:val="1003"/>
-        </w:numPr>
-        <w:jc w:val="left"/>
-        <w:keepNext w:val="0"/>
-        <w:keepLines w:val="0"/>
-        <w:widowControl w:val="1"/>
-      </w:pPr>
-      <w:hyperlink w:anchor="m-funnel">
-        <w:r>
-          <w:rPr>
-            <w:rStyle w:val="Hyperlink"/>
-          </w:rPr>
-          <w:t xml:space="preserve">Validation funnel</w:t>
-        </w:r>
-      </w:hyperlink>
-    </w:p>
-    <w:p>
-      <w:pPr>
-        <w:pStyle w:val="ReferenceEntry"/>
-        <w:numPr>
-          <w:ilvl w:val="1"/>
-          <w:numId w:val="1003"/>
-        </w:numPr>
-        <w:jc w:val="left"/>
-        <w:keepNext w:val="0"/>
-        <w:keepLines w:val="0"/>
-        <w:widowControl w:val="1"/>
-      </w:pPr>
-      <w:hyperlink w:anchor="m-calibration">
-        <w:r>
-          <w:rPr>
-            <w:rStyle w:val="Hyperlink"/>
-          </w:rPr>
-          <w:t xml:space="preserve">Six-anchor DFT calibration</w:t>
-        </w:r>
-      </w:hyperlink>
-    </w:p>
-    <w:p>
-      <w:pPr>
-        <w:pStyle w:val="ReferenceEntry"/>
-        <w:numPr>
-          <w:ilvl w:val="1"/>
-          <w:numId w:val="1003"/>
-        </w:numPr>
-        <w:jc w:val="left"/>
-        <w:keepNext w:val="0"/>
-        <w:keepLines w:val="0"/>
-        <w:widowControl w:val="1"/>
-      </w:pPr>
-      <w:hyperlink w:anchor="m-compute">
-        <w:r>
-          <w:rPr>
-            <w:rStyle w:val="Hyperlink"/>
-          </w:rPr>
-          <w:t xml:space="preserve">Compute footprint</w:t>
-        </w:r>
-      </w:hyperlink>
-    </w:p>
-    <w:p>
-      <w:pPr>
-        <w:pStyle w:val="ReferenceEntry"/>
-        <w:numPr>
-          <w:ilvl w:val="1"/>
-          <w:numId w:val="1003"/>
-        </w:numPr>
-        <w:jc w:val="left"/>
-        <w:keepNext w:val="0"/>
-        <w:keepLines w:val="0"/>
-        <w:widowControl w:val="1"/>
-      </w:pPr>
-      <w:hyperlink w:anchor="m-data">
-        <w:r>
-          <w:rPr>
-            <w:rStyle w:val="Hyperlink"/>
-          </w:rPr>
-          <w:t xml:space="preserve">Data and code availability</w:t>
-        </w:r>
-      </w:hyperlink>
-    </w:p>
-    <w:p>
-      <w:pPr>
-        <w:pStyle w:val="ReferenceEntry"/>
-        <w:numPr>
-          <w:ilvl w:val="0"/>
-          <w:numId w:val="1001"/>
-        </w:numPr>
-        <w:jc w:val="left"/>
-        <w:keepNext w:val="0"/>
-        <w:keepLines w:val="0"/>
-        <w:widowControl w:val="1"/>
-      </w:pPr>
-      <w:hyperlink w:anchor="sec-acks">
-        <w:r>
-          <w:rPr>
-            <w:rStyle w:val="Hyperlink"/>
-          </w:rPr>
-          <w:t xml:space="preserve">Acknowledgements, contributions, additional information</w:t>
-        </w:r>
-      </w:hyperlink>
-    </w:p>
-    <w:p>
-      <w:pPr>
-        <w:pStyle w:val="ReferenceEntry"/>
-        <w:numPr>
-          <w:ilvl w:val="0"/>
-          <w:numId w:val="1001"/>
-        </w:numPr>
-        <w:jc w:val="left"/>
-        <w:keepNext w:val="0"/>
-        <w:keepLines w:val="0"/>
-        <w:widowControl w:val="1"/>
-      </w:pPr>
-      <w:hyperlink w:anchor="sec-edlegends">
-        <w:r>
-          <w:rPr>
-            <w:rStyle w:val="Hyperlink"/>
-          </w:rPr>
-          <w:t xml:space="preserve">Extended Data legends</w:t>
-        </w:r>
-      </w:hyperlink>
-    </w:p>
-    <w:p>
-      <w:pPr>
-        <w:pStyle w:val="ReferenceEntry"/>
-        <w:jc w:val="left"/>
         <w:keepNext w:val="0"/>
         <w:keepLines w:val="0"/>
         <w:widowControl w:val="1"/>
@@ -683,8 +249,8 @@
     </w:p>
     <w:p>
       <w:pPr>
-        <w:pStyle w:val="ReferenceEntry"/>
-        <w:jc w:val="left"/>
+        <w:pStyle w:val="BodyText"/>
+        <w:jc w:val="both"/>
         <w:keepNext w:val="0"/>
         <w:keepLines w:val="0"/>
         <w:widowControl w:val="1"/>
@@ -706,8 +272,8 @@
     </w:p>
     <w:p>
       <w:pPr>
-        <w:pStyle w:val="ReferenceEntry"/>
-        <w:jc w:val="left"/>
+        <w:pStyle w:val="BodyText"/>
+        <w:jc w:val="both"/>
         <w:keepNext w:val="0"/>
         <w:keepLines w:val="0"/>
         <w:widowControl w:val="1"/>
@@ -5753,7 +5319,7 @@
         <w:pStyle w:val="ReferenceEntry"/>
         <w:numPr>
           <w:ilvl w:val="0"/>
-          <w:numId w:val="1004"/>
+          <w:numId w:val="1001"/>
         </w:numPr>
         <w:jc w:val="left"/>
         <w:keepNext w:val="0"/>
@@ -5794,7 +5360,7 @@
         <w:pStyle w:val="ReferenceEntry"/>
         <w:numPr>
           <w:ilvl w:val="0"/>
-          <w:numId w:val="1004"/>
+          <w:numId w:val="1001"/>
         </w:numPr>
         <w:jc w:val="left"/>
         <w:keepNext w:val="0"/>
@@ -5835,7 +5401,7 @@
         <w:pStyle w:val="ReferenceEntry"/>
         <w:numPr>
           <w:ilvl w:val="0"/>
-          <w:numId w:val="1004"/>
+          <w:numId w:val="1001"/>
         </w:numPr>
         <w:jc w:val="left"/>
         <w:keepNext w:val="0"/>
@@ -5885,7 +5451,7 @@
         <w:pStyle w:val="ReferenceEntry"/>
         <w:numPr>
           <w:ilvl w:val="0"/>
-          <w:numId w:val="1004"/>
+          <w:numId w:val="1001"/>
         </w:numPr>
         <w:jc w:val="left"/>
         <w:keepNext w:val="0"/>
@@ -5919,7 +5485,7 @@
         <w:pStyle w:val="ReferenceEntry"/>
         <w:numPr>
           <w:ilvl w:val="0"/>
-          <w:numId w:val="1004"/>
+          <w:numId w:val="1001"/>
         </w:numPr>
         <w:jc w:val="left"/>
         <w:keepNext w:val="0"/>
@@ -5960,7 +5526,7 @@
         <w:pStyle w:val="ReferenceEntry"/>
         <w:numPr>
           <w:ilvl w:val="0"/>
-          <w:numId w:val="1004"/>
+          <w:numId w:val="1001"/>
         </w:numPr>
         <w:jc w:val="left"/>
         <w:keepNext w:val="0"/>
@@ -6001,7 +5567,7 @@
         <w:pStyle w:val="ReferenceEntry"/>
         <w:numPr>
           <w:ilvl w:val="0"/>
-          <w:numId w:val="1004"/>
+          <w:numId w:val="1001"/>
         </w:numPr>
         <w:jc w:val="left"/>
         <w:keepNext w:val="0"/>
@@ -6058,7 +5624,7 @@
         <w:pStyle w:val="ReferenceEntry"/>
         <w:numPr>
           <w:ilvl w:val="0"/>
-          <w:numId w:val="1004"/>
+          <w:numId w:val="1001"/>
         </w:numPr>
         <w:jc w:val="left"/>
         <w:keepNext w:val="0"/>
@@ -6115,7 +5681,7 @@
         <w:pStyle w:val="ReferenceEntry"/>
         <w:numPr>
           <w:ilvl w:val="0"/>
-          <w:numId w:val="1004"/>
+          <w:numId w:val="1001"/>
         </w:numPr>
         <w:jc w:val="left"/>
         <w:keepNext w:val="0"/>
@@ -6165,7 +5731,7 @@
         <w:pStyle w:val="ReferenceEntry"/>
         <w:numPr>
           <w:ilvl w:val="0"/>
-          <w:numId w:val="1004"/>
+          <w:numId w:val="1001"/>
         </w:numPr>
         <w:jc w:val="left"/>
         <w:keepNext w:val="0"/>
@@ -6206,7 +5772,7 @@
         <w:pStyle w:val="ReferenceEntry"/>
         <w:numPr>
           <w:ilvl w:val="0"/>
-          <w:numId w:val="1004"/>
+          <w:numId w:val="1001"/>
         </w:numPr>
         <w:jc w:val="left"/>
         <w:keepNext w:val="0"/>
@@ -6240,7 +5806,7 @@
         <w:pStyle w:val="ReferenceEntry"/>
         <w:numPr>
           <w:ilvl w:val="0"/>
-          <w:numId w:val="1004"/>
+          <w:numId w:val="1001"/>
         </w:numPr>
         <w:jc w:val="left"/>
         <w:keepNext w:val="0"/>
@@ -6297,7 +5863,7 @@
         <w:pStyle w:val="ReferenceEntry"/>
         <w:numPr>
           <w:ilvl w:val="0"/>
-          <w:numId w:val="1004"/>
+          <w:numId w:val="1001"/>
         </w:numPr>
         <w:jc w:val="left"/>
         <w:keepNext w:val="0"/>
@@ -6331,7 +5897,7 @@
         <w:pStyle w:val="ReferenceEntry"/>
         <w:numPr>
           <w:ilvl w:val="0"/>
-          <w:numId w:val="1004"/>
+          <w:numId w:val="1001"/>
         </w:numPr>
         <w:jc w:val="left"/>
         <w:keepNext w:val="0"/>
@@ -6365,7 +5931,7 @@
         <w:pStyle w:val="ReferenceEntry"/>
         <w:numPr>
           <w:ilvl w:val="0"/>
-          <w:numId w:val="1004"/>
+          <w:numId w:val="1001"/>
         </w:numPr>
         <w:jc w:val="left"/>
         <w:keepNext w:val="0"/>
@@ -6406,7 +5972,7 @@
         <w:pStyle w:val="ReferenceEntry"/>
         <w:numPr>
           <w:ilvl w:val="0"/>
-          <w:numId w:val="1004"/>
+          <w:numId w:val="1001"/>
         </w:numPr>
         <w:jc w:val="left"/>
         <w:keepNext w:val="0"/>
@@ -6447,7 +6013,7 @@
         <w:pStyle w:val="ReferenceEntry"/>
         <w:numPr>
           <w:ilvl w:val="0"/>
-          <w:numId w:val="1004"/>
+          <w:numId w:val="1001"/>
         </w:numPr>
         <w:jc w:val="left"/>
         <w:keepNext w:val="0"/>
@@ -6488,7 +6054,7 @@
         <w:pStyle w:val="ReferenceEntry"/>
         <w:numPr>
           <w:ilvl w:val="0"/>
-          <w:numId w:val="1004"/>
+          <w:numId w:val="1001"/>
         </w:numPr>
         <w:jc w:val="left"/>
         <w:keepNext w:val="0"/>
@@ -6540,7 +6106,7 @@
         <w:pStyle w:val="ReferenceEntry"/>
         <w:numPr>
           <w:ilvl w:val="0"/>
-          <w:numId w:val="1004"/>
+          <w:numId w:val="1001"/>
         </w:numPr>
         <w:jc w:val="left"/>
         <w:keepNext w:val="0"/>
@@ -6581,7 +6147,7 @@
         <w:pStyle w:val="ReferenceEntry"/>
         <w:numPr>
           <w:ilvl w:val="0"/>
-          <w:numId w:val="1004"/>
+          <w:numId w:val="1001"/>
         </w:numPr>
         <w:jc w:val="left"/>
         <w:keepNext w:val="0"/>
@@ -6631,7 +6197,7 @@
         <w:pStyle w:val="ReferenceEntry"/>
         <w:numPr>
           <w:ilvl w:val="0"/>
-          <w:numId w:val="1004"/>
+          <w:numId w:val="1001"/>
         </w:numPr>
         <w:jc w:val="left"/>
         <w:keepNext w:val="0"/>
@@ -6688,7 +6254,7 @@
         <w:pStyle w:val="ReferenceEntry"/>
         <w:numPr>
           <w:ilvl w:val="0"/>
-          <w:numId w:val="1004"/>
+          <w:numId w:val="1001"/>
         </w:numPr>
         <w:jc w:val="left"/>
         <w:keepNext w:val="0"/>
@@ -6738,7 +6304,7 @@
         <w:pStyle w:val="ReferenceEntry"/>
         <w:numPr>
           <w:ilvl w:val="0"/>
-          <w:numId w:val="1004"/>
+          <w:numId w:val="1001"/>
         </w:numPr>
         <w:jc w:val="left"/>
         <w:keepNext w:val="0"/>
@@ -6795,7 +6361,7 @@
         <w:pStyle w:val="ReferenceEntry"/>
         <w:numPr>
           <w:ilvl w:val="0"/>
-          <w:numId w:val="1004"/>
+          <w:numId w:val="1001"/>
         </w:numPr>
         <w:jc w:val="left"/>
         <w:keepNext w:val="0"/>
@@ -6829,7 +6395,7 @@
         <w:pStyle w:val="ReferenceEntry"/>
         <w:numPr>
           <w:ilvl w:val="0"/>
-          <w:numId w:val="1004"/>
+          <w:numId w:val="1001"/>
         </w:numPr>
         <w:jc w:val="left"/>
         <w:keepNext w:val="0"/>
@@ -6870,7 +6436,7 @@
         <w:pStyle w:val="ReferenceEntry"/>
         <w:numPr>
           <w:ilvl w:val="0"/>
-          <w:numId w:val="1004"/>
+          <w:numId w:val="1001"/>
         </w:numPr>
         <w:jc w:val="left"/>
         <w:keepNext w:val="0"/>
@@ -6911,7 +6477,7 @@
         <w:pStyle w:val="ReferenceEntry"/>
         <w:numPr>
           <w:ilvl w:val="0"/>
-          <w:numId w:val="1004"/>
+          <w:numId w:val="1001"/>
         </w:numPr>
         <w:jc w:val="left"/>
         <w:keepNext w:val="0"/>
@@ -6968,7 +6534,7 @@
         <w:pStyle w:val="ReferenceEntry"/>
         <w:numPr>
           <w:ilvl w:val="0"/>
-          <w:numId w:val="1004"/>
+          <w:numId w:val="1001"/>
         </w:numPr>
         <w:jc w:val="left"/>
         <w:keepNext w:val="0"/>
@@ -7025,7 +6591,7 @@
         <w:pStyle w:val="ReferenceEntry"/>
         <w:numPr>
           <w:ilvl w:val="0"/>
-          <w:numId w:val="1004"/>
+          <w:numId w:val="1001"/>
         </w:numPr>
         <w:jc w:val="left"/>
         <w:keepNext w:val="0"/>
@@ -7066,7 +6632,7 @@
         <w:pStyle w:val="ReferenceEntry"/>
         <w:numPr>
           <w:ilvl w:val="0"/>
-          <w:numId w:val="1004"/>
+          <w:numId w:val="1001"/>
         </w:numPr>
         <w:jc w:val="left"/>
         <w:keepNext w:val="0"/>
@@ -7107,7 +6673,7 @@
         <w:pStyle w:val="ReferenceEntry"/>
         <w:numPr>
           <w:ilvl w:val="0"/>
-          <w:numId w:val="1004"/>
+          <w:numId w:val="1001"/>
         </w:numPr>
         <w:jc w:val="left"/>
         <w:keepNext w:val="0"/>
@@ -7148,7 +6714,7 @@
         <w:pStyle w:val="ReferenceEntry"/>
         <w:numPr>
           <w:ilvl w:val="0"/>
-          <w:numId w:val="1004"/>
+          <w:numId w:val="1001"/>
         </w:numPr>
         <w:jc w:val="left"/>
         <w:keepNext w:val="0"/>
@@ -7189,7 +6755,7 @@
         <w:pStyle w:val="ReferenceEntry"/>
         <w:numPr>
           <w:ilvl w:val="0"/>
-          <w:numId w:val="1004"/>
+          <w:numId w:val="1001"/>
         </w:numPr>
         <w:jc w:val="left"/>
         <w:keepNext w:val="0"/>
@@ -7246,7 +6812,7 @@
         <w:pStyle w:val="ReferenceEntry"/>
         <w:numPr>
           <w:ilvl w:val="0"/>
-          <w:numId w:val="1004"/>
+          <w:numId w:val="1001"/>
         </w:numPr>
         <w:jc w:val="left"/>
         <w:keepNext w:val="0"/>
@@ -7287,7 +6853,7 @@
         <w:pStyle w:val="ReferenceEntry"/>
         <w:numPr>
           <w:ilvl w:val="0"/>
-          <w:numId w:val="1004"/>
+          <w:numId w:val="1001"/>
         </w:numPr>
         <w:jc w:val="left"/>
         <w:keepNext w:val="0"/>
@@ -7318,7 +6884,7 @@
         <w:pStyle w:val="ReferenceEntry"/>
         <w:numPr>
           <w:ilvl w:val="0"/>
-          <w:numId w:val="1004"/>
+          <w:numId w:val="1001"/>
         </w:numPr>
         <w:jc w:val="left"/>
         <w:keepNext w:val="0"/>
@@ -7336,7 +6902,7 @@
         <w:pStyle w:val="ReferenceEntry"/>
         <w:numPr>
           <w:ilvl w:val="0"/>
-          <w:numId w:val="1004"/>
+          <w:numId w:val="1001"/>
         </w:numPr>
         <w:jc w:val="left"/>
         <w:keepNext w:val="0"/>
@@ -7354,7 +6920,7 @@
         <w:pStyle w:val="ReferenceEntry"/>
         <w:numPr>
           <w:ilvl w:val="0"/>
-          <w:numId w:val="1004"/>
+          <w:numId w:val="1001"/>
         </w:numPr>
         <w:jc w:val="left"/>
         <w:keepNext w:val="0"/>
@@ -7404,7 +6970,7 @@
         <w:pStyle w:val="ReferenceEntry"/>
         <w:numPr>
           <w:ilvl w:val="0"/>
-          <w:numId w:val="1004"/>
+          <w:numId w:val="1001"/>
         </w:numPr>
         <w:jc w:val="left"/>
         <w:keepNext w:val="0"/>
@@ -7445,7 +7011,7 @@
         <w:pStyle w:val="ReferenceEntry"/>
         <w:numPr>
           <w:ilvl w:val="0"/>
-          <w:numId w:val="1004"/>
+          <w:numId w:val="1001"/>
         </w:numPr>
         <w:jc w:val="left"/>
         <w:keepNext w:val="0"/>
@@ -7502,7 +7068,7 @@
         <w:pStyle w:val="ReferenceEntry"/>
         <w:numPr>
           <w:ilvl w:val="0"/>
-          <w:numId w:val="1004"/>
+          <w:numId w:val="1001"/>
         </w:numPr>
         <w:jc w:val="left"/>
         <w:keepNext w:val="0"/>
@@ -7537,7 +7103,7 @@
         <w:pStyle w:val="ReferenceEntry"/>
         <w:numPr>
           <w:ilvl w:val="0"/>
-          <w:numId w:val="1004"/>
+          <w:numId w:val="1001"/>
         </w:numPr>
         <w:jc w:val="left"/>
         <w:keepNext w:val="0"/>
@@ -7594,7 +7160,7 @@
         <w:pStyle w:val="ReferenceEntry"/>
         <w:numPr>
           <w:ilvl w:val="0"/>
-          <w:numId w:val="1004"/>
+          <w:numId w:val="1001"/>
         </w:numPr>
         <w:jc w:val="left"/>
         <w:keepNext w:val="0"/>
@@ -7651,7 +7217,7 @@
         <w:pStyle w:val="ReferenceEntry"/>
         <w:numPr>
           <w:ilvl w:val="0"/>
-          <w:numId w:val="1004"/>
+          <w:numId w:val="1001"/>
         </w:numPr>
         <w:jc w:val="left"/>
         <w:keepNext w:val="0"/>
@@ -7692,7 +7258,7 @@
         <w:pStyle w:val="ReferenceEntry"/>
         <w:numPr>
           <w:ilvl w:val="0"/>
-          <w:numId w:val="1004"/>
+          <w:numId w:val="1001"/>
         </w:numPr>
         <w:jc w:val="left"/>
         <w:keepNext w:val="0"/>
@@ -7733,7 +7299,7 @@
         <w:pStyle w:val="ReferenceEntry"/>
         <w:numPr>
           <w:ilvl w:val="0"/>
-          <w:numId w:val="1004"/>
+          <w:numId w:val="1001"/>
         </w:numPr>
         <w:jc w:val="left"/>
         <w:keepNext w:val="0"/>
@@ -7774,7 +7340,7 @@
         <w:pStyle w:val="ReferenceEntry"/>
         <w:numPr>
           <w:ilvl w:val="0"/>
-          <w:numId w:val="1004"/>
+          <w:numId w:val="1001"/>
         </w:numPr>
         <w:jc w:val="left"/>
         <w:keepNext w:val="0"/>
@@ -13011,7 +12577,7 @@
       </w:r>
     </w:p>
     <w:bookmarkEnd w:id="98"/>
-    <w:bookmarkStart w:id="99" w:name="sec-addinfo"/>
+    <w:bookmarkStart w:id="101" w:name="sec-addinfo"/>
     <w:p>
       <w:pPr>
         <w:pStyle w:val="Heading2"/>
@@ -13042,7 +12608,41 @@
         <w:t xml:space="preserve"> </w:t>
       </w:r>
       <w:r>
-        <w:t xml:space="preserve">is available for this paper at NMIPaperSI.docx.</w:t>
+        <w:t xml:space="preserve">is available for this paper at</w:t>
+      </w:r>
+      <w:r>
+        <w:t xml:space="preserve"> </w:t>
+      </w:r>
+      <w:hyperlink r:id="rId99">
+        <w:r>
+          <w:rPr>
+            <w:rStyle w:val="Hyperlink"/>
+          </w:rPr>
+          <w:t xml:space="preserve">NMIPaperSI.html</w:t>
+        </w:r>
+      </w:hyperlink>
+      <w:r>
+        <w:t xml:space="preserve"> </w:t>
+      </w:r>
+      <w:r>
+        <w:t xml:space="preserve">(HTML) and</w:t>
+      </w:r>
+      <w:r>
+        <w:t xml:space="preserve"> </w:t>
+      </w:r>
+      <w:hyperlink r:id="rId100">
+        <w:r>
+          <w:rPr>
+            <w:rStyle w:val="Hyperlink"/>
+          </w:rPr>
+          <w:t xml:space="preserve">NMIPaperSI.docx</w:t>
+        </w:r>
+      </w:hyperlink>
+      <w:r>
+        <w:t xml:space="preserve"> </w:t>
+      </w:r>
+      <w:r>
+        <w:t xml:space="preserve">(Word).</w:t>
       </w:r>
       <w:r>
         <w:t xml:space="preserve"> </w:t>
@@ -13061,7 +12661,7 @@
         <w:t xml:space="preserve">should be addressed to A.A.</w:t>
       </w:r>
     </w:p>
-    <w:bookmarkEnd w:id="99"/>
+    <w:bookmarkEnd w:id="101"/>
     <w:sectPr>
       <w:footerReference w:type="default" r:id="rId9"/>
       <w:pgSz w:h="15840" w:w="12240"/>
@@ -13484,96 +13084,6 @@
     <w:abstractNumId w:val="990"/>
   </w:num>
   <w:num w:numId="1001">
-    <w:abstractNumId w:val="99201"/>
-    <w:lvlOverride w:ilvl="0">
-      <w:startOverride w:val="1"/>
-    </w:lvlOverride>
-    <w:lvlOverride w:ilvl="1">
-      <w:startOverride w:val="1"/>
-    </w:lvlOverride>
-    <w:lvlOverride w:ilvl="2">
-      <w:startOverride w:val="1"/>
-    </w:lvlOverride>
-    <w:lvlOverride w:ilvl="3">
-      <w:startOverride w:val="1"/>
-    </w:lvlOverride>
-    <w:lvlOverride w:ilvl="4">
-      <w:startOverride w:val="1"/>
-    </w:lvlOverride>
-    <w:lvlOverride w:ilvl="5">
-      <w:startOverride w:val="1"/>
-    </w:lvlOverride>
-    <w:lvlOverride w:ilvl="6">
-      <w:startOverride w:val="1"/>
-    </w:lvlOverride>
-    <w:lvlOverride w:ilvl="7">
-      <w:startOverride w:val="1"/>
-    </w:lvlOverride>
-    <w:lvlOverride w:ilvl="8">
-      <w:startOverride w:val="1"/>
-    </w:lvlOverride>
-  </w:num>
-  <w:num w:numId="1002">
-    <w:abstractNumId w:val="99201"/>
-    <w:lvlOverride w:ilvl="0">
-      <w:startOverride w:val="1"/>
-    </w:lvlOverride>
-    <w:lvlOverride w:ilvl="1">
-      <w:startOverride w:val="1"/>
-    </w:lvlOverride>
-    <w:lvlOverride w:ilvl="2">
-      <w:startOverride w:val="1"/>
-    </w:lvlOverride>
-    <w:lvlOverride w:ilvl="3">
-      <w:startOverride w:val="1"/>
-    </w:lvlOverride>
-    <w:lvlOverride w:ilvl="4">
-      <w:startOverride w:val="1"/>
-    </w:lvlOverride>
-    <w:lvlOverride w:ilvl="5">
-      <w:startOverride w:val="1"/>
-    </w:lvlOverride>
-    <w:lvlOverride w:ilvl="6">
-      <w:startOverride w:val="1"/>
-    </w:lvlOverride>
-    <w:lvlOverride w:ilvl="7">
-      <w:startOverride w:val="1"/>
-    </w:lvlOverride>
-    <w:lvlOverride w:ilvl="8">
-      <w:startOverride w:val="1"/>
-    </w:lvlOverride>
-  </w:num>
-  <w:num w:numId="1003">
-    <w:abstractNumId w:val="99201"/>
-    <w:lvlOverride w:ilvl="0">
-      <w:startOverride w:val="1"/>
-    </w:lvlOverride>
-    <w:lvlOverride w:ilvl="1">
-      <w:startOverride w:val="1"/>
-    </w:lvlOverride>
-    <w:lvlOverride w:ilvl="2">
-      <w:startOverride w:val="1"/>
-    </w:lvlOverride>
-    <w:lvlOverride w:ilvl="3">
-      <w:startOverride w:val="1"/>
-    </w:lvlOverride>
-    <w:lvlOverride w:ilvl="4">
-      <w:startOverride w:val="1"/>
-    </w:lvlOverride>
-    <w:lvlOverride w:ilvl="5">
-      <w:startOverride w:val="1"/>
-    </w:lvlOverride>
-    <w:lvlOverride w:ilvl="6">
-      <w:startOverride w:val="1"/>
-    </w:lvlOverride>
-    <w:lvlOverride w:ilvl="7">
-      <w:startOverride w:val="1"/>
-    </w:lvlOverride>
-    <w:lvlOverride w:ilvl="8">
-      <w:startOverride w:val="1"/>
-    </w:lvlOverride>
-  </w:num>
-  <w:num w:numId="1004">
     <w:abstractNumId w:val="99201"/>
     <w:lvlOverride w:ilvl="0">
       <w:startOverride w:val="1"/>

</xml_diff>

<commit_message>
Restructure title block + simplify Additional information per NMI style
Article HTML and DOCX:
- Title block: split affiliations onto separate paragraphs (previously a single block with internal <br>, easy to overlook in Word). Added explicit corresponding-author line with daggers (†) and an email placeholder [to be added] for the submitting author to fill in.
- Additional information section: dropped the verbose pointer to NMIPaperSI.html / NMIPaperSI.docx file paths. Now reads "Supplementary Information accompanies this paper. Correspondence and requests for materials should be addressed to A.A." per NMI house style.

Rebuilt NMIPaper.docx and NMIPaperSI.docx via the standard html2doc pipeline (review-manuscript profile).

Co-Authored-By: Claude Opus 4.7 (1M context) <noreply@anthropic.com>
</commit_message>
<xml_diff>
--- a/paper/NMIPaper.docx
+++ b/paper/NMIPaper.docx
@@ -41,7 +41,7 @@
         <w:rPr>
           <w:vertAlign w:val="superscript"/>
         </w:rPr>
-        <w:t xml:space="preserve">2,*</w:t>
+        <w:t xml:space="preserve">2,*†</w:t>
       </w:r>
     </w:p>
     <w:p>
@@ -58,13 +58,13 @@
           <w:sz w:val="20"/>
           <w:vertAlign w:val="superscript"/>
         </w:rPr>
-        <w:t xml:space="preserve">*</w:t>
+        <w:t xml:space="preserve">1</w:t>
       </w:r>
       <w:r>
         <w:rPr>
           <w:sz w:val="20"/>
         </w:rPr>
-        <w:t xml:space="preserve">These authors contributed equally to this work.</w:t>
+        <w:t xml:space="preserve">Department of Intelligent Systems, Afeka Tel-Aviv College of Engineering, Israel.</w:t>
       </w:r>
     </w:p>
     <w:p>
@@ -79,22 +79,56 @@
         <w:rPr>
           <w:vertAlign w:val="superscript"/>
         </w:rPr>
-        <w:t xml:space="preserve">1</w:t>
-      </w:r>
-      <w:r>
-        <w:t xml:space="preserve">Department of Intelligent Systems, Afeka Tel-Aviv College of Engineering, Israel.</w:t>
-      </w:r>
-      <w:r>
-        <w:br/>
-      </w:r>
+        <w:t xml:space="preserve">2</w:t>
+      </w:r>
+      <w:r>
+        <w:t xml:space="preserve">School of Computer Science, Faculty of Sciences, HIT–Holon Institute of Technology, Israel.</w:t>
+      </w:r>
+    </w:p>
+    <w:p>
+      <w:pPr>
+        <w:pStyle w:val="BodyText"/>
+        <w:jc w:val="both"/>
+        <w:keepNext w:val="0"/>
+        <w:keepLines w:val="0"/>
+        <w:widowControl w:val="1"/>
+      </w:pPr>
       <w:r>
         <w:rPr>
           <w:vertAlign w:val="superscript"/>
         </w:rPr>
-        <w:t xml:space="preserve">2</w:t>
-      </w:r>
-      <w:r>
-        <w:t xml:space="preserve">School of Computer Science, Faculty of Sciences, HIT–Holon Institute of Technology, Israel.</w:t>
+        <w:t xml:space="preserve">*</w:t>
+      </w:r>
+      <w:r>
+        <w:t xml:space="preserve">These authors contributed equally to this work.</w:t>
+      </w:r>
+    </w:p>
+    <w:p>
+      <w:pPr>
+        <w:pStyle w:val="BodyText"/>
+        <w:jc w:val="both"/>
+        <w:keepNext w:val="0"/>
+        <w:keepLines w:val="0"/>
+        <w:widowControl w:val="1"/>
+      </w:pPr>
+      <w:r>
+        <w:rPr>
+          <w:vertAlign w:val="superscript"/>
+        </w:rPr>
+        <w:t xml:space="preserve">†</w:t>
+      </w:r>
+      <w:r>
+        <w:t xml:space="preserve">Corresponding author. Email:</w:t>
+      </w:r>
+      <w:r>
+        <w:t xml:space="preserve"> </w:t>
+      </w:r>
+      <w:r>
+        <w:rPr>
+          <w:i/>
+          <w:iCs/>
+        </w:rPr>
+        <w:t xml:space="preserve">[to be added]</w:t>
       </w:r>
     </w:p>
     <w:bookmarkEnd w:id="9"/>
@@ -12577,7 +12611,7 @@
       </w:r>
     </w:p>
     <w:bookmarkEnd w:id="98"/>
-    <w:bookmarkStart w:id="101" w:name="sec-addinfo"/>
+    <w:bookmarkStart w:id="99" w:name="sec-addinfo"/>
     <w:p>
       <w:pPr>
         <w:pStyle w:val="Heading2"/>
@@ -12608,41 +12642,7 @@
         <w:t xml:space="preserve"> </w:t>
       </w:r>
       <w:r>
-        <w:t xml:space="preserve">is available for this paper at</w:t>
-      </w:r>
-      <w:r>
-        <w:t xml:space="preserve"> </w:t>
-      </w:r>
-      <w:hyperlink r:id="rId99">
-        <w:r>
-          <w:rPr>
-            <w:rStyle w:val="Hyperlink"/>
-          </w:rPr>
-          <w:t xml:space="preserve">NMIPaperSI.html</w:t>
-        </w:r>
-      </w:hyperlink>
-      <w:r>
-        <w:t xml:space="preserve"> </w:t>
-      </w:r>
-      <w:r>
-        <w:t xml:space="preserve">(HTML) and</w:t>
-      </w:r>
-      <w:r>
-        <w:t xml:space="preserve"> </w:t>
-      </w:r>
-      <w:hyperlink r:id="rId100">
-        <w:r>
-          <w:rPr>
-            <w:rStyle w:val="Hyperlink"/>
-          </w:rPr>
-          <w:t xml:space="preserve">NMIPaperSI.docx</w:t>
-        </w:r>
-      </w:hyperlink>
-      <w:r>
-        <w:t xml:space="preserve"> </w:t>
-      </w:r>
-      <w:r>
-        <w:t xml:space="preserve">(Word).</w:t>
+        <w:t xml:space="preserve">accompanies this paper.</w:t>
       </w:r>
       <w:r>
         <w:t xml:space="preserve"> </w:t>
@@ -12661,7 +12661,7 @@
         <w:t xml:space="preserve">should be addressed to A.A.</w:t>
       </w:r>
     </w:p>
-    <w:bookmarkEnd w:id="101"/>
+    <w:bookmarkEnd w:id="99"/>
     <w:sectPr>
       <w:footerReference w:type="default" r:id="rId9"/>
       <w:pgSz w:h="15840" w:w="12240"/>

</xml_diff>

<commit_message>
Designate Y.A. as corresponding author with email
Move the dagger marker from A.A. to Y.A. in the title block; add Y.A.'s email apersteiny@afeka.ac.il. Update Additional information section so "Correspondence and requests for materials should be addressed to Y.A." Rebuilt NMIPaper.docx.

Co-Authored-By: Claude Opus 4.7 (1M context) <noreply@anthropic.com>
</commit_message>
<xml_diff>
--- a/paper/NMIPaper.docx
+++ b/paper/NMIPaper.docx
@@ -32,7 +32,7 @@
         <w:rPr>
           <w:vertAlign w:val="superscript"/>
         </w:rPr>
-        <w:t xml:space="preserve">1,*</w:t>
+        <w:t xml:space="preserve">1,*†</w:t>
       </w:r>
       <w:r>
         <w:t xml:space="preserve">, Alexander Apartsin</w:t>
@@ -41,7 +41,7 @@
         <w:rPr>
           <w:vertAlign w:val="superscript"/>
         </w:rPr>
-        <w:t xml:space="preserve">2,*†</w:t>
+        <w:t xml:space="preserve">2,*</w:t>
       </w:r>
     </w:p>
     <w:p>
@@ -118,17 +118,7 @@
         <w:t xml:space="preserve">†</w:t>
       </w:r>
       <w:r>
-        <w:t xml:space="preserve">Corresponding author. Email:</w:t>
-      </w:r>
-      <w:r>
-        <w:t xml:space="preserve"> </w:t>
-      </w:r>
-      <w:r>
-        <w:rPr>
-          <w:i/>
-          <w:iCs/>
-        </w:rPr>
-        <w:t xml:space="preserve">[to be added]</w:t>
+        <w:t xml:space="preserve">Corresponding author. Email: apersteiny@afeka.ac.il</w:t>
       </w:r>
     </w:p>
     <w:bookmarkEnd w:id="9"/>
@@ -12658,7 +12648,7 @@
         <w:t xml:space="preserve"> </w:t>
       </w:r>
       <w:r>
-        <w:t xml:space="preserve">should be addressed to A.A.</w:t>
+        <w:t xml:space="preserve">should be addressed to Y.A.</w:t>
       </w:r>
     </w:p>
     <w:bookmarkEnd w:id="99"/>

</xml_diff>

<commit_message>
Trim to 50 references per NMI Article limit
NMI Article submissions are restricted to 50 references (Nature LaTeX template, "Articles are restricted to 50 references, Letters to 30"). We were at 51 after adding Zeni/Liu/Chen/Wen for prior-work positioning.

Dropped: Stephens et al. 1994 (B3LYP citation, formerly ref 47). It was the third citation in a B3LYP triple-cite at the Methods stage-4 DFT step; Becke 1993 (ref 16) and LYP 1988 (ref 17) already cover B3LYP authoritatively.

Renumbered body citations 48-51 -> 47-50 (Zeni MatterGen, Liu de novo HEDM, Chen DiffSMol, Wen EMFF-2025). Bibliography integrity verified: 50 defined, 50 cited, numbered 1-50 with no gaps. Rebuilt NMIPaper.docx.

Co-Authored-By: Claude Opus 4.7 (1M context) <noreply@anthropic.com>
</commit_message>
<xml_diff>
--- a/paper/NMIPaper.docx
+++ b/paper/NMIPaper.docx
@@ -225,7 +225,7 @@
           <w:rPr>
             <w:rStyle w:val="Hyperlink"/>
           </w:rPr>
-          <w:t xml:space="preserve">48</w:t>
+          <w:t xml:space="preserve">47</w:t>
         </w:r>
       </w:hyperlink>
       <w:r>
@@ -239,7 +239,7 @@
           <w:rPr>
             <w:rStyle w:val="Hyperlink"/>
           </w:rPr>
-          <w:t xml:space="preserve">50</w:t>
+          <w:t xml:space="preserve">49</w:t>
         </w:r>
       </w:hyperlink>
       <w:r>
@@ -250,7 +250,7 @@
           <w:rPr>
             <w:rStyle w:val="Hyperlink"/>
           </w:rPr>
-          <w:t xml:space="preserve">49</w:t>
+          <w:t xml:space="preserve">48</w:t>
         </w:r>
       </w:hyperlink>
       <w:r>
@@ -5355,7 +5355,7 @@
           <w:rPr>
             <w:rStyle w:val="Hyperlink"/>
           </w:rPr>
-          <w:t xml:space="preserve">48</w:t>
+          <w:t xml:space="preserve">47</w:t>
         </w:r>
       </w:hyperlink>
       <w:r>
@@ -5369,7 +5369,7 @@
           <w:rPr>
             <w:rStyle w:val="Hyperlink"/>
           </w:rPr>
-          <w:t xml:space="preserve">49</w:t>
+          <w:t xml:space="preserve">48</w:t>
         </w:r>
       </w:hyperlink>
       <w:r>
@@ -5383,7 +5383,7 @@
           <w:rPr>
             <w:rStyle w:val="Hyperlink"/>
           </w:rPr>
-          <w:t xml:space="preserve">51</w:t>
+          <w:t xml:space="preserve">50</w:t>
         </w:r>
       </w:hyperlink>
       <w:r>
@@ -5406,7 +5406,7 @@
       </w:r>
     </w:p>
     <w:bookmarkEnd w:id="32"/>
-    <w:bookmarkStart w:id="87" w:name="sec-refs"/>
+    <w:bookmarkStart w:id="86" w:name="sec-refs"/>
     <w:p>
       <w:pPr>
         <w:pStyle w:val="ReferencesHeading"/>
@@ -7464,9 +7464,9 @@
         <w:keepLines w:val="0"/>
         <w:widowControl w:val="1"/>
       </w:pPr>
-      <w:bookmarkStart w:id="80" w:name="ref-stephens1994"/>
-      <w:r>
-        <w:t xml:space="preserve">Stephens, P. J., Devlin, F. J., Chabalowski, C. F. &amp; Frisch, M. J. Ab initio calculation of vibrational absorption and circular dichroism spectra using density functional force fields.</w:t>
+      <w:bookmarkStart w:id="80" w:name="ref-zeni2025mattergen"/>
+      <w:r>
+        <w:t xml:space="preserve">Zeni, C.</w:t>
       </w:r>
       <w:r>
         <w:t xml:space="preserve"> </w:t>
@@ -7476,7 +7476,23 @@
           <w:i/>
           <w:iCs/>
         </w:rPr>
-        <w:t xml:space="preserve">J. Phys. Chem.</w:t>
+        <w:t xml:space="preserve">et al.</w:t>
+      </w:r>
+      <w:r>
+        <w:t xml:space="preserve"> </w:t>
+      </w:r>
+      <w:r>
+        <w:t xml:space="preserve">A generative model for inorganic materials design.</w:t>
+      </w:r>
+      <w:r>
+        <w:t xml:space="preserve"> </w:t>
+      </w:r>
+      <w:r>
+        <w:rPr>
+          <w:i/>
+          <w:iCs/>
+        </w:rPr>
+        <w:t xml:space="preserve">Nature</w:t>
       </w:r>
       <w:r>
         <w:t xml:space="preserve"> </w:t>
@@ -7486,10 +7502,10 @@
           <w:b/>
           <w:bCs/>
         </w:rPr>
-        <w:t xml:space="preserve">98</w:t>
-      </w:r>
-      <w:r>
-        <w:t xml:space="preserve">, 11623–11627 (1994).</w:t>
+        <w:t xml:space="preserve">639</w:t>
+      </w:r>
+      <w:r>
+        <w:t xml:space="preserve">, 624–632 (2025).</w:t>
       </w:r>
       <w:bookmarkEnd w:id="80"/>
     </w:p>
@@ -7505,9 +7521,9 @@
         <w:keepLines w:val="0"/>
         <w:widowControl w:val="1"/>
       </w:pPr>
-      <w:bookmarkStart w:id="81" w:name="ref-zeni2025mattergen"/>
-      <w:r>
-        <w:t xml:space="preserve">Zeni, C.</w:t>
+      <w:bookmarkStart w:id="82" w:name="ref-liu2025denovohedm"/>
+      <w:r>
+        <w:t xml:space="preserve">Liu, J.</w:t>
       </w:r>
       <w:r>
         <w:t xml:space="preserve"> </w:t>
@@ -7523,7 +7539,7 @@
         <w:t xml:space="preserve"> </w:t>
       </w:r>
       <w:r>
-        <w:t xml:space="preserve">A generative model for inorganic materials design.</w:t>
+        <w:t xml:space="preserve">De novo multi-objective generation framework for energetic materials with trading off energy and stability.</w:t>
       </w:r>
       <w:r>
         <w:t xml:space="preserve"> </w:t>
@@ -7533,22 +7549,29 @@
           <w:i/>
           <w:iCs/>
         </w:rPr>
-        <w:t xml:space="preserve">Nature</w:t>
-      </w:r>
-      <w:r>
-        <w:t xml:space="preserve"> </w:t>
-      </w:r>
-      <w:r>
-        <w:rPr>
-          <w:b/>
-          <w:bCs/>
-        </w:rPr>
-        <w:t xml:space="preserve">639</w:t>
-      </w:r>
-      <w:r>
-        <w:t xml:space="preserve">, 624–632 (2025).</w:t>
-      </w:r>
-      <w:bookmarkEnd w:id="81"/>
+        <w:t xml:space="preserve">npj Comput. Mater.</w:t>
+      </w:r>
+      <w:r>
+        <w:t xml:space="preserve"> </w:t>
+      </w:r>
+      <w:r>
+        <w:t xml:space="preserve">(2025).</w:t>
+      </w:r>
+      <w:r>
+        <w:t xml:space="preserve"> </w:t>
+      </w:r>
+      <w:hyperlink r:id="rId81">
+        <w:r>
+          <w:rPr>
+            <w:rStyle w:val="Hyperlink"/>
+          </w:rPr>
+          <w:t xml:space="preserve">https://doi.org/10.1038/s41524-025-01845-6</w:t>
+        </w:r>
+      </w:hyperlink>
+      <w:r>
+        <w:t xml:space="preserve">.</w:t>
+      </w:r>
+      <w:bookmarkEnd w:id="82"/>
     </w:p>
     <w:p>
       <w:pPr>
@@ -7562,9 +7585,9 @@
         <w:keepLines w:val="0"/>
         <w:widowControl w:val="1"/>
       </w:pPr>
-      <w:bookmarkStart w:id="83" w:name="ref-liu2025denovohedm"/>
-      <w:r>
-        <w:t xml:space="preserve">Liu, J.</w:t>
+      <w:bookmarkStart w:id="83" w:name="ref-chen2025diffsmol"/>
+      <w:r>
+        <w:t xml:space="preserve">Chen, Z., Peng, B., Zhai, T.</w:t>
       </w:r>
       <w:r>
         <w:t xml:space="preserve"> </w:t>
@@ -7580,7 +7603,7 @@
         <w:t xml:space="preserve"> </w:t>
       </w:r>
       <w:r>
-        <w:t xml:space="preserve">De novo multi-objective generation framework for energetic materials with trading off energy and stability.</w:t>
+        <w:t xml:space="preserve">Generating 3D small binding molecules using shape-conditioned diffusion models with guidance.</w:t>
       </w:r>
       <w:r>
         <w:t xml:space="preserve"> </w:t>
@@ -7590,27 +7613,20 @@
           <w:i/>
           <w:iCs/>
         </w:rPr>
-        <w:t xml:space="preserve">npj Comput. Mater.</w:t>
-      </w:r>
-      <w:r>
-        <w:t xml:space="preserve"> </w:t>
-      </w:r>
-      <w:r>
-        <w:t xml:space="preserve">(2025).</w:t>
-      </w:r>
-      <w:r>
-        <w:t xml:space="preserve"> </w:t>
-      </w:r>
-      <w:hyperlink r:id="rId82">
-        <w:r>
-          <w:rPr>
-            <w:rStyle w:val="Hyperlink"/>
-          </w:rPr>
-          <w:t xml:space="preserve">https://doi.org/10.1038/s41524-025-01845-6</w:t>
-        </w:r>
-      </w:hyperlink>
-      <w:r>
-        <w:t xml:space="preserve">.</w:t>
+        <w:t xml:space="preserve">Nat. Mach. Intell.</w:t>
+      </w:r>
+      <w:r>
+        <w:t xml:space="preserve"> </w:t>
+      </w:r>
+      <w:r>
+        <w:rPr>
+          <w:b/>
+          <w:bCs/>
+        </w:rPr>
+        <w:t xml:space="preserve">7</w:t>
+      </w:r>
+      <w:r>
+        <w:t xml:space="preserve">, 758–770 (2025).</w:t>
       </w:r>
       <w:bookmarkEnd w:id="83"/>
     </w:p>
@@ -7626,9 +7642,9 @@
         <w:keepLines w:val="0"/>
         <w:widowControl w:val="1"/>
       </w:pPr>
-      <w:bookmarkStart w:id="84" w:name="ref-chen2025diffsmol"/>
-      <w:r>
-        <w:t xml:space="preserve">Chen, Z., Peng, B., Zhai, T.</w:t>
+      <w:bookmarkStart w:id="85" w:name="ref-wen2025emff"/>
+      <w:r>
+        <w:t xml:space="preserve">Wen, M.</w:t>
       </w:r>
       <w:r>
         <w:t xml:space="preserve"> </w:t>
@@ -7644,63 +7660,6 @@
         <w:t xml:space="preserve"> </w:t>
       </w:r>
       <w:r>
-        <w:t xml:space="preserve">Generating 3D small binding molecules using shape-conditioned diffusion models with guidance.</w:t>
-      </w:r>
-      <w:r>
-        <w:t xml:space="preserve"> </w:t>
-      </w:r>
-      <w:r>
-        <w:rPr>
-          <w:i/>
-          <w:iCs/>
-        </w:rPr>
-        <w:t xml:space="preserve">Nat. Mach. Intell.</w:t>
-      </w:r>
-      <w:r>
-        <w:t xml:space="preserve"> </w:t>
-      </w:r>
-      <w:r>
-        <w:rPr>
-          <w:b/>
-          <w:bCs/>
-        </w:rPr>
-        <w:t xml:space="preserve">7</w:t>
-      </w:r>
-      <w:r>
-        <w:t xml:space="preserve">, 758–770 (2025).</w:t>
-      </w:r>
-      <w:bookmarkEnd w:id="84"/>
-    </w:p>
-    <w:p>
-      <w:pPr>
-        <w:pStyle w:val="ReferenceEntry"/>
-        <w:numPr>
-          <w:ilvl w:val="0"/>
-          <w:numId w:val="1001"/>
-        </w:numPr>
-        <w:jc w:val="left"/>
-        <w:keepNext w:val="0"/>
-        <w:keepLines w:val="0"/>
-        <w:widowControl w:val="1"/>
-      </w:pPr>
-      <w:bookmarkStart w:id="86" w:name="ref-wen2025emff"/>
-      <w:r>
-        <w:t xml:space="preserve">Wen, M.</w:t>
-      </w:r>
-      <w:r>
-        <w:t xml:space="preserve"> </w:t>
-      </w:r>
-      <w:r>
-        <w:rPr>
-          <w:i/>
-          <w:iCs/>
-        </w:rPr>
-        <w:t xml:space="preserve">et al.</w:t>
-      </w:r>
-      <w:r>
-        <w:t xml:space="preserve"> </w:t>
-      </w:r>
-      <w:r>
         <w:t xml:space="preserve">EMFF-2025: a general neural network potential for energetic materials with C, H, N, and O elements.</w:t>
       </w:r>
       <w:r>
@@ -7722,7 +7681,7 @@
       <w:r>
         <w:t xml:space="preserve"> </w:t>
       </w:r>
-      <w:hyperlink r:id="rId85">
+      <w:hyperlink r:id="rId84">
         <w:r>
           <w:rPr>
             <w:rStyle w:val="Hyperlink"/>
@@ -7733,10 +7692,10 @@
       <w:r>
         <w:t xml:space="preserve">.</w:t>
       </w:r>
-      <w:bookmarkEnd w:id="86"/>
+      <w:bookmarkEnd w:id="85"/>
     </w:p>
-    <w:bookmarkEnd w:id="87"/>
-    <w:bookmarkStart w:id="100" w:name="sec-methods"/>
+    <w:bookmarkEnd w:id="86"/>
+    <w:bookmarkStart w:id="99" w:name="sec-methods"/>
     <w:p>
       <w:pPr>
         <w:pStyle w:val="Heading2"/>
@@ -7748,7 +7707,7 @@
         <w:t xml:space="preserve">Methods</w:t>
       </w:r>
     </w:p>
-    <w:bookmarkStart w:id="88" w:name="m-dataset"/>
+    <w:bookmarkStart w:id="87" w:name="m-dataset"/>
     <w:p>
       <w:pPr>
         <w:pStyle w:val="Heading3"/>
@@ -8158,8 +8117,8 @@
         <w:t xml:space="preserve">tail) is described under "Two complementary denoisers" below. Combined with the tier-gated conditional gradient, the asymmetric oversampling raises the mean predicted detonation velocity of the top leads by 0.4 km/s relative to a uniform-sampling control.</w:t>
       </w:r>
     </w:p>
-    <w:bookmarkEnd w:id="88"/>
-    <w:bookmarkStart w:id="89" w:name="m-limo"/>
+    <w:bookmarkEnd w:id="87"/>
+    <w:bookmarkStart w:id="88" w:name="m-limo"/>
     <w:p>
       <w:pPr>
         <w:pStyle w:val="Heading3"/>
@@ -8727,8 +8686,8 @@
         <w:t xml:space="preserve">, the per-row tier weight, the per-property availability mask, and per-property normalisation statistics (mean and standard deviation over the trusted Tier-A and Tier-B subset).</w:t>
       </w:r>
     </w:p>
-    <w:bookmarkEnd w:id="89"/>
-    <w:bookmarkStart w:id="90" w:name="m-denoisers"/>
+    <w:bookmarkEnd w:id="88"/>
+    <w:bookmarkStart w:id="89" w:name="m-denoisers"/>
     <w:p>
       <w:pPr>
         <w:pStyle w:val="Heading3"/>
@@ -9842,8 +9801,8 @@
         <w:t xml:space="preserve">at pool = 8k per setting.</w:t>
       </w:r>
     </w:p>
-    <w:bookmarkEnd w:id="90"/>
-    <w:bookmarkStart w:id="91" w:name="m-scoremodel"/>
+    <w:bookmarkEnd w:id="89"/>
+    <w:bookmarkStart w:id="90" w:name="m-scoremodel"/>
     <w:p>
       <w:pPr>
         <w:pStyle w:val="Heading3"/>
@@ -10656,8 +10615,8 @@
         <w:t xml:space="preserve">sits at order one at convergence: viability and hazard at 1.0, sensitivity and SA at 0.5, SC at 0.3, performance at 0.7.</w:t>
       </w:r>
     </w:p>
-    <w:bookmarkEnd w:id="91"/>
-    <w:bookmarkStart w:id="92" w:name="m-sampling"/>
+    <w:bookmarkEnd w:id="90"/>
+    <w:bookmarkStart w:id="91" w:name="m-sampling"/>
     <w:p>
       <w:pPr>
         <w:pStyle w:val="Heading3"/>
@@ -11398,8 +11357,8 @@
         <w:t xml:space="preserve">40k each); the pools are unioned, canonical-SMILES deduplicated, and fed to the validation funnel. An optional five-lane configuration (two production lanes plus three diversity-axis lanes varying conditioning targets and guidance configurations) lifts post-filter yield approximately fivefold and surfaces 24 distinct Bemis–Murcko scaffolds versus seven in a single lane, at proportional compute cost.</w:t>
       </w:r>
     </w:p>
-    <w:bookmarkEnd w:id="92"/>
-    <w:bookmarkStart w:id="93" w:name="m-funnel"/>
+    <w:bookmarkEnd w:id="91"/>
+    <w:bookmarkStart w:id="92" w:name="m-funnel"/>
     <w:p>
       <w:pPr>
         <w:pStyle w:val="Heading3"/>
@@ -11911,14 +11870,6 @@
           <w:t xml:space="preserve">17</w:t>
         </w:r>
       </w:hyperlink>
-      <w:hyperlink w:anchor="ref-stephens1994">
-        <w:r>
-          <w:rPr>
-            <w:rStyle w:val="Hyperlink"/>
-          </w:rPr>
-          <w:t xml:space="preserve">47</w:t>
-        </w:r>
-      </w:hyperlink>
       <w:r>
         <w:t xml:space="preserve">/6-31G(d) optimisation followed by</w:t>
       </w:r>
@@ -12101,8 +12052,8 @@
         <w:t xml:space="preserve">all 12 confirmed as real local minima.</w:t>
       </w:r>
     </w:p>
-    <w:bookmarkEnd w:id="93"/>
-    <w:bookmarkStart w:id="94" w:name="m-calibration"/>
+    <w:bookmarkEnd w:id="92"/>
+    <w:bookmarkStart w:id="93" w:name="m-calibration"/>
     <w:p>
       <w:pPr>
         <w:pStyle w:val="Heading3"/>
@@ -12588,8 +12539,8 @@
         <w:t xml:space="preserve">, which we do not run; we report relative ranking against the six anchors and quantify the regime residual on 575 Tier-A experimental rows.</w:t>
       </w:r>
     </w:p>
-    <w:bookmarkEnd w:id="94"/>
-    <w:bookmarkStart w:id="95" w:name="m-compute"/>
+    <w:bookmarkEnd w:id="93"/>
+    <w:bookmarkStart w:id="94" w:name="m-compute"/>
     <w:p>
       <w:pPr>
         <w:pStyle w:val="Heading3"/>
@@ -12736,8 +12687,8 @@
         <w:t xml:space="preserve">4 CPU-hours, all on rented datacenter A100 instances at standard commercial pay-per-use rates (Modal and vast.ai).</w:t>
       </w:r>
     </w:p>
-    <w:bookmarkEnd w:id="95"/>
-    <w:bookmarkStart w:id="97" w:name="m-data"/>
+    <w:bookmarkEnd w:id="94"/>
+    <w:bookmarkStart w:id="96" w:name="m-data"/>
     <w:p>
       <w:pPr>
         <w:pStyle w:val="Heading3"/>
@@ -12763,7 +12714,7 @@
       <w:r>
         <w:t xml:space="preserve"> </w:t>
       </w:r>
-      <w:hyperlink r:id="rId96">
+      <w:hyperlink r:id="rId95">
         <w:r>
           <w:rPr>
             <w:rStyle w:val="Hyperlink"/>
@@ -12792,8 +12743,8 @@
         <w:t xml:space="preserve">queries used the public PUG REST endpoint.</w:t>
       </w:r>
     </w:p>
-    <w:bookmarkEnd w:id="97"/>
-    <w:bookmarkStart w:id="99" w:name="m-code"/>
+    <w:bookmarkEnd w:id="96"/>
+    <w:bookmarkStart w:id="98" w:name="m-code"/>
     <w:p>
       <w:pPr>
         <w:pStyle w:val="Heading3"/>
@@ -12819,7 +12770,7 @@
       <w:r>
         <w:t xml:space="preserve"> </w:t>
       </w:r>
-      <w:hyperlink r:id="rId98">
+      <w:hyperlink r:id="rId97">
         <w:r>
           <w:rPr>
             <w:rStyle w:val="Hyperlink"/>
@@ -12834,9 +12785,9 @@
         <w:t xml:space="preserve">under Apache-2.0. Trained model checkpoints (LIMO encoder, two denoisers, multi-task score model at rounds 0/1/2 of self-distillation) are released on Zenodo under CC-BY-4.0 in the same deposit as the data. Reproduction of Figure 1 takes approximately ten minutes on commodity hardware following the README quick-start; full re-derivation of the twelve DFT-confirmed leads takes approximately 45 GPU-hours.</w:t>
       </w:r>
     </w:p>
+    <w:bookmarkEnd w:id="98"/>
     <w:bookmarkEnd w:id="99"/>
-    <w:bookmarkEnd w:id="100"/>
-    <w:bookmarkStart w:id="101" w:name="sec-acks"/>
+    <w:bookmarkStart w:id="100" w:name="sec-acks"/>
     <w:p>
       <w:pPr>
         <w:pStyle w:val="Heading2"/>
@@ -12860,8 +12811,8 @@
         <w:t xml:space="preserve">We thank the open-source maintainers of RDKit, GFN2-xTB, PySCF and GPU4PySCF, whose tools form the validation backbone of this paper. Cloud GPU compute was procured at standard commercial rates from Modal and vast.ai; we acknowledge their pay-per-use platforms for making first-principles audit accessible to small research groups. We thank the LIMO authors for releasing their pretrained checkpoint, which we fine-tune in this work.</w:t>
       </w:r>
     </w:p>
-    <w:bookmarkEnd w:id="101"/>
-    <w:bookmarkStart w:id="102" w:name="sec-funding"/>
+    <w:bookmarkEnd w:id="100"/>
+    <w:bookmarkStart w:id="101" w:name="sec-funding"/>
     <w:p>
       <w:pPr>
         <w:pStyle w:val="Heading2"/>
@@ -12885,8 +12836,8 @@
         <w:t xml:space="preserve">This work received no specific external funding.</w:t>
       </w:r>
     </w:p>
-    <w:bookmarkEnd w:id="102"/>
-    <w:bookmarkStart w:id="103" w:name="sec-contrib"/>
+    <w:bookmarkEnd w:id="101"/>
+    <w:bookmarkStart w:id="102" w:name="sec-contrib"/>
     <w:p>
       <w:pPr>
         <w:pStyle w:val="Heading2"/>
@@ -12910,8 +12861,8 @@
         <w:t xml:space="preserve">Y.A. and A.A. contributed equally to all aspects of this work, including conception, methodology design, model implementation, experiments, validation, and manuscript preparation.</w:t>
       </w:r>
     </w:p>
-    <w:bookmarkEnd w:id="103"/>
-    <w:bookmarkStart w:id="104" w:name="sec-coi"/>
+    <w:bookmarkEnd w:id="102"/>
+    <w:bookmarkStart w:id="103" w:name="sec-coi"/>
     <w:p>
       <w:pPr>
         <w:pStyle w:val="Heading2"/>
@@ -12935,8 +12886,8 @@
         <w:t xml:space="preserve">The authors declare no competing interests.</w:t>
       </w:r>
     </w:p>
-    <w:bookmarkEnd w:id="104"/>
-    <w:bookmarkStart w:id="105" w:name="sec-addinfo"/>
+    <w:bookmarkEnd w:id="103"/>
+    <w:bookmarkStart w:id="104" w:name="sec-addinfo"/>
     <w:p>
       <w:pPr>
         <w:pStyle w:val="Heading2"/>
@@ -12986,7 +12937,7 @@
         <w:t xml:space="preserve">should be addressed to Y.A.</w:t>
       </w:r>
     </w:p>
-    <w:bookmarkEnd w:id="105"/>
+    <w:bookmarkEnd w:id="104"/>
     <w:sectPr>
       <w:footerReference w:type="default" r:id="rId9"/>
       <w:pgSz w:h="15840" w:w="12240"/>

</xml_diff>